<commit_message>
Added all codes to a single text file
</commit_message>
<xml_diff>
--- a/Fintegrity_Proje_Raporu_Final.docx
+++ b/Fintegrity_Proje_Raporu_Final.docx
@@ -75,7 +75,21 @@
           <w:rFonts w:ascii="Times New Roman" w:hAnsi="Times New Roman"/>
           <w:sz w:val="24"/>
         </w:rPr>
-        <w:t>Projemiz; kamu kurum/kuruluşlarının ve özel sektörün e-dönüşüm işlemlerinin, banka entegrasyonlarının ve muhasebe süreçlerinin blockchain altyapısı ile modernize edilmesi projesidir. ARD Grup Bilişim bünyesinde staj projesi kapsamında geliştirilmiş MVP/prototip seviyesinde bir finansal entegrasyon platformudur. Fintegrity; geleneksel e-dönüşüm süreçlerini (e-Fatura, e-İrsaliye, e-Sözleşme, e-Makbuz) blockchain altyapısı ile güvence altına alırken, yapay zeka entegrasyonu ile şüpheli işlem ve anomali tespiti gerçekleştirmektedir.</w:t>
+        <w:t>Projemiz; kamu kurum/kuruluşlarının ve özel sektörün e-dönüşüm işlemlerinin, banka entegrasyonlarının ve muhasebe süreçlerinin blockchain altyapısı ile modernize edilmesi projesidir. ARD Grup Bilişim bünyesinde staj projesi kapsamında geliştirilmiş MVP/prototip seviyesinde bir finansal entegrasyon platformudur. Fintegrity; geleneksel e-dönüşüm süreçlerini (e-Fatura, e-İrsaliye, e-Sözleşme, e-Makbuz) blockchain altyapısı ile güvence altına alırken, yapay zek</w:t>
+      </w:r>
+      <w:r>
+        <w:rPr>
+          <w:rFonts w:ascii="Times New Roman" w:hAnsi="Times New Roman"/>
+          <w:sz w:val="24"/>
+        </w:rPr>
+        <w:t>a</w:t>
+      </w:r>
+      <w:r>
+        <w:rPr>
+          <w:rFonts w:ascii="Times New Roman" w:hAnsi="Times New Roman"/>
+          <w:sz w:val="24"/>
+        </w:rPr>
+        <w:t xml:space="preserve"> entegrasyonu ile şüpheli işlem ve anomali tespiti gerçekleştirmektedir.</w:t>
       </w:r>
     </w:p>
     <w:p>
@@ -2041,27 +2055,6 @@
           <w:sz w:val="24"/>
         </w:rPr>
         <w:t>Platform, özel entegratör altyapılarına doğrudan uyum sağlayabilecek modüler bir SaaS (Software as a Service) mimarisine sahiptir.</w:t>
-      </w:r>
-    </w:p>
-    <w:p>
-      <w:pPr>
-        <w:pStyle w:val="ListBullet"/>
-        <w:spacing w:after="80"/>
-      </w:pPr>
-      <w:r>
-        <w:rPr>
-          <w:rFonts w:ascii="Times New Roman" w:hAnsi="Times New Roman"/>
-          <w:b/>
-          <w:sz w:val="24"/>
-        </w:rPr>
-        <w:t xml:space="preserve">Gelir ve Verimlilik Artışı: </w:t>
-      </w:r>
-      <w:r>
-        <w:rPr>
-          <w:rFonts w:ascii="Times New Roman" w:hAnsi="Times New Roman"/>
-          <w:sz w:val="24"/>
-        </w:rPr>
-        <w:t>Geliştirilen otomasyon ve blockchain doğrulama sistemi sayesinde, fiziksel işlem maliyetlerinin azaltılarak şirketin gelirlerini kısa vadede %5, orta vadede %12 ve uzun vadede %34 oranında artırma potansiyeline sahip olduğu öngörülmektedir.</w:t>
       </w:r>
     </w:p>
     <w:p>

</xml_diff>